<commit_message>
LR progression and context report md file creation
</commit_message>
<xml_diff>
--- a/Uzii/Literature Review.docx
+++ b/Uzii/Literature Review.docx
@@ -215,10 +215,7 @@
         <w:t xml:space="preserve">Before ML emerged, clinicians used </w:t>
       </w:r>
       <w:r>
-        <w:t>rule-based scoring systems that are limited by poor specificity and lack of predictive capa</w:t>
-      </w:r>
-      <w:r>
-        <w:t xml:space="preserve">bility in </w:t>
+        <w:t xml:space="preserve">rule-based scoring systems that are limited by poor specificity and lack of predictive capability in </w:t>
       </w:r>
       <w:proofErr w:type="spellStart"/>
       <w:r>
@@ -380,136 +377,607 @@
         <w:t>Carroll et al. (2023)</w:t>
       </w:r>
       <w:r>
+        <w:t xml:space="preserve">. </w:t>
+      </w:r>
+      <w:proofErr w:type="gramStart"/>
+      <w:r>
+        <w:t>But</w:t>
+      </w:r>
+      <w:proofErr w:type="gramEnd"/>
+      <w:r>
+        <w:t xml:space="preserve"> this tool was designed to </w:t>
+      </w:r>
+      <w:r>
+        <w:t>assess the degree of organ dysfunction in critically ill children</w:t>
+      </w:r>
+      <w:r>
+        <w:t xml:space="preserve">, not to predict </w:t>
+      </w:r>
+      <w:proofErr w:type="spellStart"/>
+      <w:r>
+        <w:t>pediatric</w:t>
+      </w:r>
+      <w:proofErr w:type="spellEnd"/>
+      <w:r>
+        <w:t xml:space="preserve"> sepsis, therefore it is a severity s</w:t>
+      </w:r>
+      <w:r>
+        <w:t>core and not a predicting model which is a fundamental mismatch for early warning systems.</w:t>
+      </w:r>
+      <w:r>
+        <w:t xml:space="preserve"> </w:t>
+      </w:r>
+      <w:r>
+        <w:t xml:space="preserve">The Phoenix Sepsis Score was introduced by Sanchez-Pinto et al. (2024) and validated through an international consensus effort by </w:t>
+      </w:r>
+      <w:proofErr w:type="spellStart"/>
+      <w:r>
+        <w:t>Schlapbach</w:t>
+      </w:r>
+      <w:proofErr w:type="spellEnd"/>
+      <w:r>
+        <w:t xml:space="preserve"> et al. (2024) to address these limitations, redefining </w:t>
+      </w:r>
+      <w:proofErr w:type="spellStart"/>
+      <w:r>
+        <w:t>pediatric</w:t>
+      </w:r>
+      <w:proofErr w:type="spellEnd"/>
+      <w:r>
+        <w:t xml:space="preserve"> sepsis as life-threatening organ dysfunction caused by infection</w:t>
+      </w:r>
+      <w:r>
+        <w:t xml:space="preserve">. </w:t>
+      </w:r>
+      <w:r>
+        <w:t>It</w:t>
+      </w:r>
+      <w:r>
+        <w:t xml:space="preserve"> </w:t>
+      </w:r>
+      <w:r>
+        <w:t>evaluates</w:t>
+      </w:r>
+      <w:r>
+        <w:t xml:space="preserve"> a</w:t>
+      </w:r>
+      <w:r>
+        <w:t xml:space="preserve"> composite score</w:t>
+      </w:r>
+      <w:r>
+        <w:t xml:space="preserve"> across four domains: respiratory, cardiovascular, coagulation, and neurological.</w:t>
+      </w:r>
+      <w:r>
+        <w:t xml:space="preserve"> Phoenix is far more globally </w:t>
+      </w:r>
+      <w:r>
+        <w:t>representative</w:t>
+      </w:r>
+      <w:r>
+        <w:t xml:space="preserve"> than SIRS as the evidence suggest</w:t>
+      </w:r>
+      <w:r>
+        <w:t>s</w:t>
+      </w:r>
+      <w:r>
+        <w:t xml:space="preserve"> through validation </w:t>
+      </w:r>
+      <w:r>
+        <w:t>across 10 countries and 3 million+ patient encounters</w:t>
+      </w:r>
+      <w:r>
+        <w:t xml:space="preserve"> (</w:t>
+      </w:r>
+      <w:proofErr w:type="spellStart"/>
+      <w:r>
+        <w:t>Schlapbach</w:t>
+      </w:r>
+      <w:proofErr w:type="spellEnd"/>
+      <w:r>
+        <w:t xml:space="preserve"> et al., 2024)</w:t>
+      </w:r>
+      <w:r>
         <w:t>.</w:t>
       </w:r>
-      <w:r>
-        <w:t xml:space="preserve"> </w:t>
-      </w:r>
-      <w:proofErr w:type="gramStart"/>
-      <w:r>
-        <w:t>But</w:t>
-      </w:r>
-      <w:proofErr w:type="gramEnd"/>
-      <w:r>
-        <w:t xml:space="preserve"> this tool was designed to </w:t>
-      </w:r>
-      <w:r>
-        <w:t>assess the degree of organ dysfunc</w:t>
-      </w:r>
-      <w:r>
-        <w:t>tion in critically ill children</w:t>
-      </w:r>
-      <w:r>
-        <w:t xml:space="preserve">, not to predict </w:t>
-      </w:r>
-      <w:proofErr w:type="spellStart"/>
-      <w:r>
-        <w:t>pediatric</w:t>
-      </w:r>
-      <w:proofErr w:type="spellEnd"/>
-      <w:r>
-        <w:t xml:space="preserve"> sepsis, therefore it is a severity s</w:t>
-      </w:r>
-      <w:r>
-        <w:t>core and not a predicting model which is a fundamental mismatch for early warning systems.</w:t>
-      </w:r>
-      <w:r>
-        <w:t xml:space="preserve"> </w:t>
-      </w:r>
-      <w:r>
-        <w:t xml:space="preserve">The Phoenix Sepsis Score was introduced by Sanchez-Pinto et al. (2024) and validated through an international consensus effort by </w:t>
-      </w:r>
-      <w:proofErr w:type="spellStart"/>
-      <w:r>
-        <w:t>Schlapbach</w:t>
-      </w:r>
-      <w:proofErr w:type="spellEnd"/>
-      <w:r>
-        <w:t xml:space="preserve"> et al. (2024) to address these limitations, redefining </w:t>
-      </w:r>
-      <w:proofErr w:type="spellStart"/>
-      <w:r>
-        <w:t>pediatric</w:t>
-      </w:r>
-      <w:proofErr w:type="spellEnd"/>
-      <w:r>
-        <w:t xml:space="preserve"> sepsis as life-threatening organ </w:t>
-      </w:r>
-      <w:r>
-        <w:t>dysfunction caused by infection</w:t>
-      </w:r>
-      <w:r>
-        <w:t xml:space="preserve">. </w:t>
-      </w:r>
-      <w:r>
-        <w:t>It</w:t>
-      </w:r>
-      <w:r>
-        <w:t xml:space="preserve"> </w:t>
-      </w:r>
-      <w:r>
-        <w:t>evaluates</w:t>
-      </w:r>
-      <w:r>
-        <w:t xml:space="preserve"> a</w:t>
-      </w:r>
-      <w:r>
-        <w:t xml:space="preserve"> composite score</w:t>
-      </w:r>
-      <w:r>
-        <w:t xml:space="preserve"> across four domains: respiratory, cardiovascular, coagulation, and neurological.</w:t>
-      </w:r>
-      <w:r>
-        <w:t xml:space="preserve"> Phoenix is far more globally </w:t>
-      </w:r>
-      <w:r>
-        <w:t>representative</w:t>
-      </w:r>
-      <w:r>
-        <w:t xml:space="preserve"> than SIRS as the evidence suggest</w:t>
-      </w:r>
-      <w:r>
-        <w:t>s</w:t>
-      </w:r>
-      <w:r>
-        <w:t xml:space="preserve"> through validation </w:t>
-      </w:r>
-      <w:r>
-        <w:t>across 10 countries and 3 million+ patient encounters</w:t>
-      </w:r>
-      <w:r>
-        <w:t xml:space="preserve"> </w:t>
-      </w:r>
-      <w:r>
-        <w:t>(</w:t>
-      </w:r>
-      <w:proofErr w:type="spellStart"/>
-      <w:r>
-        <w:t>Schlapbach</w:t>
-      </w:r>
-      <w:proofErr w:type="spellEnd"/>
-      <w:r>
-        <w:t xml:space="preserve"> et al., 2024)</w:t>
-      </w:r>
-      <w:r>
-        <w:t>.</w:t>
-      </w:r>
+    </w:p>
+    <w:p/>
+    <w:p/>
+    <w:p/>
+    <w:p/>
+    <w:p>
+      <w:pPr>
+        <w:rPr>
+          <w:iCs/>
+        </w:rPr>
+      </w:pPr>
     </w:p>
     <w:p/>
     <w:p>
-      <w:bookmarkStart w:id="0" w:name="_GoBack"/>
-      <w:bookmarkEnd w:id="0"/>
+      <w:r>
+        <w:lastRenderedPageBreak/>
+        <w:t>Phoenix does not merely refine ho</w:t>
+      </w:r>
+      <w:r>
+        <w:t xml:space="preserve">w </w:t>
+      </w:r>
+      <w:proofErr w:type="spellStart"/>
+      <w:r>
+        <w:t>pediatric</w:t>
+      </w:r>
+      <w:proofErr w:type="spellEnd"/>
+      <w:r>
+        <w:t xml:space="preserve"> sepsis is define rather </w:t>
+      </w:r>
+      <w:r>
+        <w:t xml:space="preserve">it changes what the definition is measuring entirely. Rather than using inflammatory markers as a proxy for illness severity, Phoenix scores organ dysfunction directly across four domains: respiratory, cardiovascular, coagulation, and neurological, with a total score of 2 or above indicating sepsis (Sanchez-Pinto et al., 2024; </w:t>
+      </w:r>
+      <w:proofErr w:type="spellStart"/>
+      <w:r>
+        <w:t>Schlapbach</w:t>
+      </w:r>
+      <w:proofErr w:type="spellEnd"/>
+      <w:r>
+        <w:t xml:space="preserve"> et al., 2024). The framework </w:t>
+      </w:r>
+      <w:proofErr w:type="gramStart"/>
+      <w:r>
+        <w:t>was validated</w:t>
+      </w:r>
+      <w:proofErr w:type="gramEnd"/>
+      <w:r>
+        <w:t xml:space="preserve"> against data from over three million patient encounters, a scale that gives it cross-population credibility no earlier </w:t>
+      </w:r>
+      <w:proofErr w:type="spellStart"/>
+      <w:r>
+        <w:t>pediatric</w:t>
+      </w:r>
+      <w:proofErr w:type="spellEnd"/>
+      <w:r>
+        <w:t xml:space="preserve"> definition could claim (</w:t>
+      </w:r>
+      <w:proofErr w:type="spellStart"/>
+      <w:r>
+        <w:t>Schlapbach</w:t>
+      </w:r>
+      <w:proofErr w:type="spellEnd"/>
+      <w:r>
+        <w:t xml:space="preserve"> et al., 2024). This study uses Phoenix as its labelling standard </w:t>
+      </w:r>
+      <w:proofErr w:type="gramStart"/>
+      <w:r>
+        <w:t>because it is the only definition that operationalizes actual organ failure rather than systemic inflammation as a stand-in (Sanchez-Pinto et al., 2024)</w:t>
+      </w:r>
+      <w:proofErr w:type="gramEnd"/>
+      <w:r>
+        <w:t xml:space="preserve">. </w:t>
+      </w:r>
+      <w:r>
+        <w:t xml:space="preserve">An important methodological constraint must nonetheless be acknowledged. </w:t>
+      </w:r>
+      <w:r>
+        <w:t xml:space="preserve">The </w:t>
+      </w:r>
+      <w:proofErr w:type="spellStart"/>
+      <w:r>
+        <w:t>Pediatric</w:t>
+      </w:r>
+      <w:proofErr w:type="spellEnd"/>
+      <w:r>
+        <w:t xml:space="preserve"> Intensive Care (PIC) database, which serves as the data source for this study, does not record </w:t>
+      </w:r>
+      <w:proofErr w:type="spellStart"/>
+      <w:r>
+        <w:t>FiO</w:t>
+      </w:r>
+      <w:proofErr w:type="spellEnd"/>
+      <w:r>
+        <w:t xml:space="preserve">₂ or mechanical ventilation parameters, making the respiratory Phoenix component non-computable; similarly, the absence of GCS documentation renders the neurological component effectively zero throughout the cohort (Zeng et al., 2020). Sepsis classification in this study therefore rests on the cardiovascular and coagulation Phoenix domains </w:t>
+      </w:r>
+      <w:proofErr w:type="gramStart"/>
+      <w:r>
+        <w:t xml:space="preserve">alone </w:t>
+      </w:r>
+      <w:r>
+        <w:t>which is a limitation</w:t>
+      </w:r>
+      <w:proofErr w:type="gramEnd"/>
+      <w:r>
+        <w:t xml:space="preserve"> acknowledged in prior machine learning studies applying Phoenix criteria to datasets with incomplete physiological coverage</w:t>
+      </w:r>
+      <w:r>
+        <w:t xml:space="preserve"> (</w:t>
+      </w:r>
+      <w:proofErr w:type="spellStart"/>
+      <w:r>
+        <w:t>Chanci</w:t>
+      </w:r>
+      <w:proofErr w:type="spellEnd"/>
+      <w:r>
+        <w:t xml:space="preserve"> et al., 2025). While this is a genuine constraint, it does not undermine the validity of the labelling approach, given that cardiovascular instability and coagulation dysfunction </w:t>
+      </w:r>
+      <w:proofErr w:type="gramStart"/>
+      <w:r>
+        <w:t>are consistently identified</w:t>
+      </w:r>
+      <w:proofErr w:type="gramEnd"/>
+      <w:r>
+        <w:t xml:space="preserve"> as the dominant organ failure signatures driving mortality and deterioration in </w:t>
+      </w:r>
+      <w:proofErr w:type="spellStart"/>
+      <w:r>
+        <w:t>pediatric</w:t>
+      </w:r>
+      <w:proofErr w:type="spellEnd"/>
+      <w:r>
+        <w:t xml:space="preserve"> sepsis.</w:t>
+      </w:r>
     </w:p>
     <w:p/>
     <w:p/>
     <w:p>
+      <w:r>
+        <w:rPr>
+          <w:b/>
+          <w:sz w:val="28"/>
+        </w:rPr>
+        <w:t>SECTION 2 — ML for Sepsis Prediction</w:t>
+      </w:r>
+      <w:r>
+        <w:rPr>
+          <w:b/>
+          <w:sz w:val="28"/>
+        </w:rPr>
+        <w:t>:</w:t>
+      </w:r>
+      <w:r>
+        <w:rPr>
+          <w:b/>
+          <w:sz w:val="28"/>
+        </w:rPr>
+        <w:br/>
+      </w:r>
+      <w:r>
+        <w:rPr>
+          <w:b/>
+          <w:sz w:val="28"/>
+        </w:rPr>
+        <w:br/>
+      </w:r>
+      <w:r>
+        <w:t xml:space="preserve">The application of machine learning to sepsis prediction has expanded </w:t>
+      </w:r>
+      <w:r>
+        <w:t xml:space="preserve">considerably over the past decade to the point where the systematic reviews now catalogue the field in the hundreds of published models. </w:t>
+      </w:r>
+      <w:proofErr w:type="spellStart"/>
+      <w:r>
+        <w:t>Fleuren</w:t>
+      </w:r>
+      <w:proofErr w:type="spellEnd"/>
+      <w:r>
+        <w:t xml:space="preserve"> et al. (2020) identified over 150 such studies in a comprehensive review of the literature, while</w:t>
+      </w:r>
+      <w:r>
+        <w:t xml:space="preserve"> Yang et al. (2023) examined 23 studies with a narrower methodological lens, each arriving at the shared conclusion that predictive performance has improved </w:t>
+      </w:r>
+      <w:r>
+        <w:t xml:space="preserve">substantially with the adoption of richer clinical feature sets and </w:t>
+      </w:r>
+      <w:proofErr w:type="gramStart"/>
+      <w:r>
+        <w:t>more sophisticated algorithms</w:t>
+      </w:r>
+      <w:proofErr w:type="gramEnd"/>
+      <w:r>
+        <w:t xml:space="preserve">. A persistent structural bias in this body of work, however, is its near exclusive </w:t>
+      </w:r>
+      <w:r>
+        <w:t>focus</w:t>
+      </w:r>
+      <w:r>
+        <w:t xml:space="preserve"> on adult populations; MIMIC-III and MIMIC-IV are the dominant training datasets, and the representational </w:t>
+      </w:r>
+      <w:r>
+        <w:t xml:space="preserve">assumptions embedded in models trained on adult ICU physiology do not transfer cleanly </w:t>
+      </w:r>
+      <w:r>
+        <w:t xml:space="preserve">to children. The </w:t>
+      </w:r>
+      <w:proofErr w:type="spellStart"/>
+      <w:r>
+        <w:t>pediatric</w:t>
+      </w:r>
+      <w:proofErr w:type="spellEnd"/>
+      <w:r>
+        <w:t xml:space="preserve"> specific literature remains comparatively sparse. </w:t>
+      </w:r>
+      <w:r>
+        <w:t xml:space="preserve">Le et al. (2019) trained one of the earlier </w:t>
+      </w:r>
+      <w:proofErr w:type="spellStart"/>
+      <w:r>
+        <w:t>pediatric</w:t>
+      </w:r>
+      <w:proofErr w:type="spellEnd"/>
+      <w:r>
+        <w:t>-specific models on UCSF PICU data, reaching an AUROC of 0.916 at four hours before onset — performance that established that early prediction was achievable in children, though replication across different hospital systems has been limited. The field also carries a quality problem that volume alone has not resolved. Deng et al. (2022) showed that leakage, weak cross-validation, and inconsistent outcome definitions show up repeatedly across the sepsis ML literature, which makes comparing results across studies a largely unreliable exercise and overstates how capable many of these models actually are.</w:t>
+      </w:r>
+      <w:r>
+        <w:br/>
+      </w:r>
+      <w:r>
+        <w:br/>
+        <w:t xml:space="preserve">Among the architectures applied to structured clinical data, gradient boosted decision trees have repeatedly come out on top. </w:t>
+      </w:r>
+      <w:proofErr w:type="spellStart"/>
+      <w:r>
+        <w:t>XGBoost</w:t>
+      </w:r>
+      <w:proofErr w:type="spellEnd"/>
+      <w:r>
+        <w:t xml:space="preserve">, </w:t>
+      </w:r>
+      <w:proofErr w:type="spellStart"/>
+      <w:r>
+        <w:t>LightGBM</w:t>
+      </w:r>
+      <w:proofErr w:type="spellEnd"/>
+      <w:r>
+        <w:t xml:space="preserve">, and </w:t>
+      </w:r>
+      <w:proofErr w:type="spellStart"/>
+      <w:r>
+        <w:t>CatBoost</w:t>
+      </w:r>
+      <w:proofErr w:type="spellEnd"/>
+      <w:r>
+        <w:t xml:space="preserve"> handle non-linear feature interactions and mixed variable types without requiring the kind of </w:t>
+      </w:r>
+      <w:proofErr w:type="spellStart"/>
+      <w:r>
+        <w:t>preprocessing</w:t>
+      </w:r>
+      <w:proofErr w:type="spellEnd"/>
+      <w:r>
+        <w:t xml:space="preserve"> that neural networks demand, and their native mechanisms for dealing with class imbalance make them practically well suited to ICU datasets where positive cases are rare. In the </w:t>
+      </w:r>
+      <w:proofErr w:type="spellStart"/>
+      <w:r>
+        <w:t>pediatric</w:t>
+      </w:r>
+      <w:proofErr w:type="spellEnd"/>
+      <w:r>
+        <w:t xml:space="preserve"> sepsis </w:t>
+      </w:r>
+      <w:proofErr w:type="gramStart"/>
+      <w:r>
+        <w:t>literature</w:t>
+      </w:r>
+      <w:proofErr w:type="gramEnd"/>
+      <w:r>
+        <w:t xml:space="preserve"> this preference </w:t>
+      </w:r>
+      <w:r>
+        <w:t xml:space="preserve">has been confirmed empirically. </w:t>
+      </w:r>
+      <w:proofErr w:type="spellStart"/>
+      <w:r>
+        <w:t>Chanci</w:t>
+      </w:r>
+      <w:proofErr w:type="spellEnd"/>
+      <w:r>
+        <w:t xml:space="preserve"> et al. (2025) applied </w:t>
+      </w:r>
+      <w:proofErr w:type="spellStart"/>
+      <w:r>
+        <w:t>CatBoost</w:t>
+      </w:r>
+      <w:proofErr w:type="spellEnd"/>
+      <w:r>
+        <w:t xml:space="preserve"> with Phoenix Sepsis Criteria </w:t>
+      </w:r>
+      <w:r>
+        <w:t xml:space="preserve">labelling on a US hospital dataset and reported an AUROC of 0.98, though the model </w:t>
+      </w:r>
+      <w:proofErr w:type="gramStart"/>
+      <w:r>
+        <w:t>was trained</w:t>
+      </w:r>
+      <w:proofErr w:type="gramEnd"/>
+      <w:r>
+        <w:t xml:space="preserve"> on proprietary data </w:t>
+      </w:r>
+      <w:r>
+        <w:t xml:space="preserve">and no </w:t>
+      </w:r>
+      <w:proofErr w:type="spellStart"/>
+      <w:r>
+        <w:t>explainability</w:t>
+      </w:r>
+      <w:proofErr w:type="spellEnd"/>
+      <w:r>
+        <w:t xml:space="preserve"> analysis was included, which limits both its reproducibility </w:t>
+      </w:r>
+      <w:r>
+        <w:t xml:space="preserve">and its clinical interpretability. Han et al. (2024) </w:t>
+      </w:r>
+      <w:r>
+        <w:t xml:space="preserve">combined </w:t>
+      </w:r>
+      <w:proofErr w:type="spellStart"/>
+      <w:r>
+        <w:t>CatBoost</w:t>
+      </w:r>
+      <w:proofErr w:type="spellEnd"/>
+      <w:r>
+        <w:t xml:space="preserve"> and </w:t>
+      </w:r>
+      <w:proofErr w:type="spellStart"/>
+      <w:r>
+        <w:t>XGBoost</w:t>
+      </w:r>
+      <w:proofErr w:type="spellEnd"/>
+      <w:r>
+        <w:t xml:space="preserve"> for </w:t>
+      </w:r>
+      <w:proofErr w:type="spellStart"/>
+      <w:r>
+        <w:t>pediatric</w:t>
+      </w:r>
+      <w:proofErr w:type="spellEnd"/>
+      <w:r>
+        <w:t xml:space="preserve"> bloodstream infection prediction, further establishing that ensemble tree methods </w:t>
+      </w:r>
+      <w:r>
+        <w:lastRenderedPageBreak/>
+        <w:t xml:space="preserve">generalise well to this population. Shi et al. (2025) </w:t>
+      </w:r>
+      <w:r>
+        <w:t xml:space="preserve">took a hybrid approach, pairing </w:t>
+      </w:r>
+      <w:proofErr w:type="spellStart"/>
+      <w:r>
+        <w:t>XGBoost</w:t>
+      </w:r>
+      <w:proofErr w:type="spellEnd"/>
+      <w:r>
+        <w:t xml:space="preserve"> with a gated recurrent unit and adding SHAP </w:t>
+      </w:r>
+      <w:proofErr w:type="spellStart"/>
+      <w:r>
+        <w:t>explaina</w:t>
+      </w:r>
+      <w:r>
+        <w:t>bility</w:t>
+      </w:r>
+      <w:proofErr w:type="spellEnd"/>
+      <w:r>
+        <w:t xml:space="preserve">, reaching an AUROC of 0.915. The present study continues along this line. It applies </w:t>
+      </w:r>
+      <w:proofErr w:type="spellStart"/>
+      <w:r>
+        <w:t>CatBoost</w:t>
+      </w:r>
+      <w:proofErr w:type="spellEnd"/>
+      <w:r>
+        <w:t xml:space="preserve"> with Phoenix labelling and full SHAP analysis on th</w:t>
+      </w:r>
+      <w:r>
+        <w:t xml:space="preserve">e publicly available PIC database, which addresses the reproducibility gap </w:t>
+      </w:r>
+      <w:proofErr w:type="spellStart"/>
+      <w:r>
+        <w:t>Chanci</w:t>
+      </w:r>
+      <w:proofErr w:type="spellEnd"/>
+      <w:r>
+        <w:t xml:space="preserve"> et al. (2025) left open and extends </w:t>
+      </w:r>
+      <w:proofErr w:type="gramStart"/>
+      <w:r>
+        <w:t>SHAP</w:t>
+      </w:r>
+      <w:proofErr w:type="gramEnd"/>
+      <w:r>
+        <w:t xml:space="preserve"> based interpretation to a Chinese PICU cohort that has not previously been examined under this combination. </w:t>
+      </w:r>
+    </w:p>
+    <w:p/>
+    <w:p>
       <w:pPr>
         <w:rPr>
-          <w:iCs/>
+          <w:b/>
+          <w:sz w:val="28"/>
+        </w:rPr>
+      </w:pPr>
+      <w:r>
+        <w:t xml:space="preserve">Two problems appear consistently </w:t>
+      </w:r>
+      <w:r>
+        <w:t xml:space="preserve">enough </w:t>
+      </w:r>
+      <w:r>
+        <w:t xml:space="preserve">across the sepsis ML literature to warrant treatment as active design decisions rather than background noise. The first is class imbalance. In this cohort, roughly 27.3% of patients carry the sepsis label, meaning the negative class outnumbers the positive by close to three to one. SMOTE and other oversampling strategies are the standard response to this kind of distribution. After t-SNE visualisation of the feature space showed substantial overlap between sepsis-positive and sepsis-negative patients in this dataset, synthetic oversampling </w:t>
+      </w:r>
+      <w:proofErr w:type="gramStart"/>
+      <w:r>
+        <w:t>was ruled out</w:t>
+      </w:r>
+      <w:proofErr w:type="gramEnd"/>
+      <w:r>
+        <w:t xml:space="preserve">. Generating artificial minority samples in a region where the two classes are not cleanly separable risks inflating performance metrics without actually improving the model’s ability to </w:t>
+      </w:r>
+      <w:r>
+        <w:t>distinguish real cases.</w:t>
+      </w:r>
+      <w:r>
+        <w:t xml:space="preserve"> Class weights of 0:1.0 and 1:2.7 </w:t>
+      </w:r>
+      <w:proofErr w:type="gramStart"/>
+      <w:r>
+        <w:t>were used</w:t>
+      </w:r>
+      <w:proofErr w:type="gramEnd"/>
+      <w:r>
+        <w:t xml:space="preserve"> instead, consistent with how prior work with PIC data has handled the same problem (Bravo and Fajardo, 2025). The second problem is leakage, which Deng et al. (2022) identified as widespread and underreported across clinical ML studies. Before any model </w:t>
+      </w:r>
+      <w:proofErr w:type="gramStart"/>
+      <w:r>
+        <w:t>was trained</w:t>
+      </w:r>
+      <w:proofErr w:type="gramEnd"/>
+      <w:r>
+        <w:t xml:space="preserve">, this study ran a systematic audit across 306 candidate features. Measurement frequency variables </w:t>
+      </w:r>
+      <w:proofErr w:type="gramStart"/>
+      <w:r>
+        <w:t>were excluded</w:t>
+      </w:r>
+      <w:proofErr w:type="gramEnd"/>
+      <w:r>
+        <w:t xml:space="preserve"> after producing an isolation AUROC of 0.878 on their own. Vasoactive medication indicators </w:t>
+      </w:r>
+      <w:proofErr w:type="gramStart"/>
+      <w:r>
+        <w:t>were excluded</w:t>
+      </w:r>
+      <w:proofErr w:type="gramEnd"/>
+      <w:r>
+        <w:t xml:space="preserve"> after producing an isolation AUROC of 0.863, and because these indicators are a direct component of the Phoenix cardiovascular scoring domain, retaining them would have introduced label leakage by construction. Removing both feature categories before training is a deliberate methodological step and addresses an inflation source that has gone uncorrected in a substantial portion of the published literature.</w:t>
+      </w:r>
+      <w:bookmarkStart w:id="0" w:name="_GoBack"/>
+      <w:bookmarkEnd w:id="0"/>
+      <w:r>
+        <w:t xml:space="preserve"> </w:t>
+      </w:r>
+      <w:r>
+        <w:br/>
+      </w:r>
+    </w:p>
+    <w:p>
+      <w:pPr>
+        <w:rPr>
+          <w:b/>
+          <w:sz w:val="28"/>
         </w:rPr>
       </w:pPr>
     </w:p>
-    <w:p/>
+    <w:p>
+      <w:r>
+        <w:rPr>
+          <w:b/>
+          <w:sz w:val="28"/>
+        </w:rPr>
+        <w:br/>
+      </w:r>
+      <w:r>
+        <w:rPr>
+          <w:b/>
+          <w:sz w:val="28"/>
+        </w:rPr>
+        <w:br/>
+      </w:r>
+    </w:p>
     <w:p/>
     <w:p/>
     <w:p/>

</xml_diff>